<commit_message>
Fix step 2 sign-off name in finance broker email sequences
Email 2 of both sequences (Commercial & Asset Finance Brokers, Specialist
Mortgage & Investment Brokers) signed off with a hardcoded "Rohan", the
Capital Financing signer, rather than the Satlas sender. Emails 1 and 3
correctly use {{sender_signature}}.

The four live PlusVibe campaigns built from this doc had the same step 2
hardcoded sign-off, spelled "Treymane" instead of "Tremayne". Those have
been corrected via the API; this brings the source doc in line so a
relaunch does not reintroduce the wrong name.

Co-Authored-By: Claude Opus 5 <noreply@anthropic.com>
Claude-Session: https://claude.ai/code/session_01YWtZB9iGnL5o4eFHvymeno
</commit_message>
<xml_diff>
--- a/OUTPUT/Campaign Tracking/Finance Broker Targeting/Satlas-Finance-Broker-Cold-Email-Sequences.docx
+++ b/OUTPUT/Campaign Tracking/Finance Broker Targeting/Satlas-Finance-Broker-Cold-Email-Sequences.docx
@@ -460,7 +460,7 @@
           <w:sz w:val="19"/>
           <w:szCs w:val="19"/>
         </w:rPr>
-        <w:t xml:space="preserve">Rohan</w:t>
+        <w:t xml:space="preserve">Tremayne</w:t>
       </w:r>
     </w:p>
     <w:p>
@@ -1062,7 +1062,7 @@
           <w:sz w:val="19"/>
           <w:szCs w:val="19"/>
         </w:rPr>
-        <w:t xml:space="preserve">Rohan</w:t>
+        <w:t xml:space="preserve">Tremayne</w:t>
       </w:r>
     </w:p>
     <w:p>

</xml_diff>